<commit_message>
updated article theme and new data mining class
</commit_message>
<xml_diff>
--- a/sistemas-distribuidos/artigo/Tema do artigo - Alexandre Silva.docx
+++ b/sistemas-distribuidos/artigo/Tema do artigo - Alexandre Silva.docx
@@ -6,101 +6,335 @@
       <w:pPr>
         <w:jc w:val="both"/>
         <w:rPr>
+          <w:sz w:val="28"/>
+          <w:szCs w:val="28"/>
+        </w:rPr>
+      </w:pPr>
+      <w:r>
+        <w:rPr>
+          <w:b w:val="1"/>
+          <w:bCs w:val="1"/>
+          <w:sz w:val="28"/>
+          <w:szCs w:val="28"/>
+          <w:rtl w:val="0"/>
+        </w:rPr>
+        <w:t xml:space="preserve">Aluno</w:t>
+      </w:r>
+      <w:r>
+        <w:rPr>
+          <w:sz w:val="28"/>
+          <w:szCs w:val="28"/>
+          <w:rtl w:val="0"/>
+        </w:rPr>
+        <w:t xml:space="preserve">: Alexandre Silva</w:t>
+      </w:r>
+    </w:p>
+    <w:p>
+      <w:pPr>
+        <w:jc w:val="both"/>
+        <w:rPr>
+          <w:sz w:val="28"/>
+          <w:szCs w:val="28"/>
+        </w:rPr>
+      </w:pPr>
+      <w:r>
+        <w:rPr>
+          <w:b w:val="1"/>
+          <w:bCs w:val="1"/>
+          <w:sz w:val="28"/>
+          <w:szCs w:val="28"/>
+          <w:rtl w:val="0"/>
+        </w:rPr>
+        <w:t xml:space="preserve">Tema</w:t>
+      </w:r>
+      <w:r>
+        <w:rPr>
+          <w:sz w:val="28"/>
+          <w:szCs w:val="28"/>
+          <w:rtl w:val="0"/>
+        </w:rPr>
+        <w:t xml:space="preserve">: </w:t>
+      </w:r>
+      <w:r>
+        <w:rPr>
+          <w:sz w:val="28"/>
+          <w:szCs w:val="28"/>
+          <w:rtl w:val="0"/>
+        </w:rPr>
+        <w:t xml:space="preserve">DQAOA</w:t>
+      </w:r>
+      <w:r>
+        <w:rPr>
+          <w:sz w:val="28"/>
+          <w:szCs w:val="28"/>
+          <w:rtl w:val="0"/>
+        </w:rPr>
+        <w:t xml:space="preserve"> (Distributed Quantum Approximate Optimization Algorithm)</w:t>
+      </w:r>
+    </w:p>
+    <w:p>
+      <w:pPr>
+        <w:jc w:val="both"/>
+        <w:rPr>
           <w:sz w:val="38"/>
           <w:szCs w:val="38"/>
         </w:rPr>
       </w:pPr>
       <w:r>
         <w:rPr>
+          <w:rtl w:val="0"/>
+        </w:rPr>
+      </w:r>
+    </w:p>
+    <w:p>
+      <w:pPr>
+        <w:jc w:val="center"/>
+        <w:rPr>
           <w:b w:val="1"/>
           <w:bCs w:val="1"/>
-          <w:sz w:val="38"/>
-          <w:szCs w:val="38"/>
-          <w:rtl w:val="0"/>
-        </w:rPr>
-        <w:t xml:space="preserve">Aluno</w:t>
-      </w:r>
-      <w:r>
-        <w:rPr>
-          <w:sz w:val="38"/>
-          <w:szCs w:val="38"/>
-          <w:rtl w:val="0"/>
-        </w:rPr>
-        <w:t xml:space="preserve">: Alexandre Silva</w:t>
-      </w:r>
-    </w:p>
-    <w:p>
-      <w:pPr>
-        <w:jc w:val="both"/>
-        <w:rPr>
-          <w:sz w:val="38"/>
-          <w:szCs w:val="38"/>
+          <w:sz w:val="40"/>
+          <w:szCs w:val="40"/>
         </w:rPr>
       </w:pPr>
       <w:r>
         <w:rPr>
           <w:b w:val="1"/>
           <w:bCs w:val="1"/>
-          <w:sz w:val="38"/>
-          <w:szCs w:val="38"/>
-          <w:rtl w:val="0"/>
-        </w:rPr>
-        <w:t xml:space="preserve">Tema do Artigo</w:t>
-      </w:r>
-      <w:r>
-        <w:rPr>
-          <w:sz w:val="38"/>
-          <w:szCs w:val="38"/>
-          <w:rtl w:val="0"/>
-        </w:rPr>
-        <w:t xml:space="preserve">: </w:t>
-      </w:r>
-      <w:r>
-        <w:rPr>
-          <w:sz w:val="38"/>
-          <w:szCs w:val="38"/>
+          <w:sz w:val="40"/>
+          <w:szCs w:val="40"/>
+          <w:rtl w:val="0"/>
+        </w:rPr>
+        <w:t xml:space="preserve">Uma análise geral da distribuição de circuitos </w:t>
+      </w:r>
+      <w:r>
+        <w:rPr>
+          <w:b w:val="1"/>
+          <w:bCs w:val="1"/>
+          <w:sz w:val="40"/>
+          <w:szCs w:val="40"/>
           <w:rtl w:val="0"/>
         </w:rPr>
         <w:t xml:space="preserve">QAOA</w:t>
       </w:r>
       <w:r>
         <w:rPr>
-          <w:sz w:val="38"/>
-          <w:szCs w:val="38"/>
-          <w:rtl w:val="0"/>
-        </w:rPr>
-        <w:t xml:space="preserve"> Distribuído</w:t>
-      </w:r>
-    </w:p>
-    <w:p>
-      <w:pPr>
-        <w:jc w:val="both"/>
-        <w:rPr>
-          <w:sz w:val="38"/>
-          <w:szCs w:val="38"/>
-        </w:rPr>
-      </w:pPr>
-      <w:r>
-        <w:rPr>
-          <w:rtl w:val="0"/>
-        </w:rPr>
-      </w:r>
-    </w:p>
-    <w:p>
-      <w:pPr>
-        <w:jc w:val="both"/>
-        <w:rPr>
-          <w:sz w:val="28"/>
-          <w:szCs w:val="28"/>
-        </w:rPr>
-      </w:pPr>
-      <w:r>
-        <w:rPr>
-          <w:sz w:val="28"/>
-          <w:szCs w:val="28"/>
-          <w:rtl w:val="0"/>
-        </w:rPr>
-        <w:t xml:space="preserve">Neste artigo, serão revisados os principais métodos divulgados na literatura para a simulação e execução de QAOA (Quantum Approximate Optimization Algorithm) de forma distribuída (também chamado de DQAOA).</w:t>
+          <w:b w:val="1"/>
+          <w:bCs w:val="1"/>
+          <w:sz w:val="40"/>
+          <w:szCs w:val="40"/>
+          <w:rtl w:val="0"/>
+        </w:rPr>
+        <w:t xml:space="preserve"> em sistemas heterogêneos  </w:t>
+      </w:r>
+    </w:p>
+    <w:p>
+      <w:pPr>
+        <w:jc w:val="both"/>
+        <w:rPr>
+          <w:b w:val="1"/>
+          <w:bCs w:val="1"/>
+          <w:sz w:val="40"/>
+          <w:szCs w:val="40"/>
+        </w:rPr>
+      </w:pPr>
+      <w:r>
+        <w:rPr>
+          <w:rtl w:val="0"/>
+        </w:rPr>
+      </w:r>
+    </w:p>
+    <w:p>
+      <w:pPr>
+        <w:jc w:val="both"/>
+        <w:rPr>
+          <w:b w:val="1"/>
+          <w:bCs w:val="1"/>
+          <w:sz w:val="40"/>
+          <w:szCs w:val="40"/>
+        </w:rPr>
+      </w:pPr>
+      <w:r>
+        <w:rPr>
+          <w:b w:val="1"/>
+          <w:bCs w:val="1"/>
+          <w:sz w:val="28"/>
+          <w:szCs w:val="28"/>
+          <w:rtl w:val="0"/>
+        </w:rPr>
+        <w:t xml:space="preserve">Introdução</w:t>
+      </w:r>
+      <w:r>
+        <w:rPr>
+          <w:b w:val="1"/>
+          <w:bCs w:val="1"/>
+          <w:sz w:val="40"/>
+          <w:szCs w:val="40"/>
+          <w:rtl w:val="0"/>
+        </w:rPr>
+        <w:t xml:space="preserve"> </w:t>
+      </w:r>
+    </w:p>
+    <w:p>
+      <w:pPr>
+        <w:jc w:val="both"/>
+        <w:rPr>
+          <w:sz w:val="28"/>
+          <w:szCs w:val="28"/>
+        </w:rPr>
+      </w:pPr>
+      <w:r>
+        <w:rPr>
+          <w:sz w:val="28"/>
+          <w:szCs w:val="28"/>
+          <w:rtl w:val="0"/>
+        </w:rPr>
+        <w:t xml:space="preserve">Computação quântica é uma área de grande interesse nos dias de hoje, visto a teórica capacidade de resolver problemas computacionalmente complexos em tempo hábil. Contudo, computadores quânticos atuais são propensos à erros e não possuem a quantidade necessária de qubits para a implementação de algoritmos considerados mais complexos.</w:t>
+      </w:r>
+    </w:p>
+    <w:p>
+      <w:pPr>
+        <w:jc w:val="both"/>
+        <w:rPr>
+          <w:sz w:val="28"/>
+          <w:szCs w:val="28"/>
+        </w:rPr>
+      </w:pPr>
+      <w:r>
+        <w:rPr>
+          <w:sz w:val="28"/>
+          <w:szCs w:val="28"/>
+          <w:rtl w:val="0"/>
+        </w:rPr>
+        <w:t xml:space="preserve">Para solucionar este problema, pesquisadores vêm adotando métodos híbridos, como QAOA. Nestes, um circuito (algoritmo quântico) pequeno é executado em um computador quântico (ou ainda simulador em um computador clássico) e, com base nos resultados, um computador clássico se encarrega de otimizar os parâmetros usados no circuito.</w:t>
+      </w:r>
+    </w:p>
+    <w:p>
+      <w:pPr>
+        <w:jc w:val="both"/>
+        <w:rPr>
+          <w:sz w:val="28"/>
+          <w:szCs w:val="28"/>
+        </w:rPr>
+      </w:pPr>
+      <w:r>
+        <w:rPr>
+          <w:sz w:val="28"/>
+          <w:szCs w:val="28"/>
+          <w:rtl w:val="0"/>
+        </w:rPr>
+        <w:t xml:space="preserve">No entanto, mesmo com o emprego de métodos híbridos, a carga necessária tanto de otimização como de execução acabam acarretando no aumento do custo computacional para ambos os lados.</w:t>
+      </w:r>
+    </w:p>
+    <w:p>
+      <w:pPr>
+        <w:jc w:val="both"/>
+        <w:rPr>
+          <w:sz w:val="28"/>
+          <w:szCs w:val="28"/>
+        </w:rPr>
+      </w:pPr>
+      <w:r>
+        <w:rPr>
+          <w:sz w:val="28"/>
+          <w:szCs w:val="28"/>
+          <w:rtl w:val="0"/>
+        </w:rPr>
+        <w:t xml:space="preserve">Devido a isto, métodos de distribuição de circuitos entre um conjunto de clusters e QPUs (Quantum Processing Units) tem se destacado como uma solução alternativa para a atual geração de computadores quânticos.</w:t>
+      </w:r>
+    </w:p>
+    <w:p>
+      <w:pPr>
+        <w:jc w:val="both"/>
+        <w:rPr>
+          <w:sz w:val="28"/>
+          <w:szCs w:val="28"/>
+        </w:rPr>
+      </w:pPr>
+      <w:r>
+        <w:rPr>
+          <w:rtl w:val="0"/>
+        </w:rPr>
+      </w:r>
+    </w:p>
+    <w:p>
+      <w:pPr>
+        <w:jc w:val="both"/>
+        <w:rPr>
+          <w:sz w:val="28"/>
+          <w:szCs w:val="28"/>
+        </w:rPr>
+      </w:pPr>
+      <w:r>
+        <w:rPr>
+          <w:b w:val="1"/>
+          <w:bCs w:val="1"/>
+          <w:sz w:val="28"/>
+          <w:szCs w:val="28"/>
+          <w:rtl w:val="0"/>
+        </w:rPr>
+        <w:t xml:space="preserve">Proposta</w:t>
+      </w:r>
+      <w:r>
+        <w:rPr>
+          <w:sz w:val="28"/>
+          <w:szCs w:val="28"/>
+          <w:rtl w:val="0"/>
+        </w:rPr>
+        <w:t xml:space="preserve"> </w:t>
+      </w:r>
+      <w:r>
+        <w:rPr>
+          <w:rtl w:val="0"/>
+        </w:rPr>
+      </w:r>
+    </w:p>
+    <w:p>
+      <w:pPr>
+        <w:jc w:val="both"/>
+        <w:rPr>
+          <w:sz w:val="28"/>
+          <w:szCs w:val="28"/>
+        </w:rPr>
+      </w:pPr>
+      <w:r>
+        <w:rPr>
+          <w:sz w:val="28"/>
+          <w:szCs w:val="28"/>
+          <w:rtl w:val="0"/>
+        </w:rPr>
+        <w:t xml:space="preserve">Com isso, neste trabalho, serão revisados os principais métodos divulgados na literatura para a simulação e execução de QAOA (Quantum Approximate Optimization Algorithm) de forma distribuída (</w:t>
+      </w:r>
+      <w:r>
+        <w:rPr>
+          <w:sz w:val="28"/>
+          <w:szCs w:val="28"/>
+          <w:rtl w:val="0"/>
+        </w:rPr>
+        <w:t xml:space="preserve">DQAOA</w:t>
+      </w:r>
+      <w:r>
+        <w:rPr>
+          <w:sz w:val="28"/>
+          <w:szCs w:val="28"/>
+          <w:rtl w:val="0"/>
+        </w:rPr>
+        <w:t xml:space="preserve">) tanto entre clusters como o conjunto cluster + </w:t>
+      </w:r>
+      <w:r>
+        <w:rPr>
+          <w:sz w:val="28"/>
+          <w:szCs w:val="28"/>
+          <w:rtl w:val="0"/>
+        </w:rPr>
+        <w:t xml:space="preserve">QPUs</w:t>
+      </w:r>
+      <w:r>
+        <w:rPr>
+          <w:sz w:val="28"/>
+          <w:szCs w:val="28"/>
+          <w:rtl w:val="0"/>
+        </w:rPr>
+        <w:t xml:space="preserve">.</w:t>
       </w:r>
     </w:p>
     <w:p>
@@ -241,6 +475,29 @@
         <w:rPr>
           <w:sz w:val="28"/>
           <w:szCs w:val="28"/>
+          <w:u w:val="none"/>
+        </w:rPr>
+      </w:pPr>
+      <w:r>
+        <w:rPr>
+          <w:sz w:val="28"/>
+          <w:szCs w:val="28"/>
+          <w:rtl w:val="0"/>
+        </w:rPr>
+        <w:t xml:space="preserve">Caching;</w:t>
+      </w:r>
+    </w:p>
+    <w:p>
+      <w:pPr>
+        <w:numPr>
+          <w:ilvl w:val="0"/>
+          <w:numId w:val="1"/>
+        </w:numPr>
+        <w:ind w:left="720" w:hanging="360"/>
+        <w:jc w:val="both"/>
+        <w:rPr>
+          <w:sz w:val="28"/>
+          <w:szCs w:val="28"/>
         </w:rPr>
       </w:pPr>
       <w:r>
@@ -262,11 +519,63 @@
       </w:pPr>
       <w:r>
         <w:rPr>
-          <w:sz w:val="28"/>
-          <w:szCs w:val="28"/>
-          <w:rtl w:val="0"/>
-        </w:rPr>
-        <w:t xml:space="preserve">O principal artigo usado para este trabalho se encontra em: </w:t>
+          <w:rtl w:val="0"/>
+        </w:rPr>
+      </w:r>
+    </w:p>
+    <w:p>
+      <w:pPr>
+        <w:jc w:val="both"/>
+        <w:rPr>
+          <w:b w:val="1"/>
+          <w:bCs w:val="1"/>
+          <w:sz w:val="28"/>
+          <w:szCs w:val="28"/>
+        </w:rPr>
+      </w:pPr>
+      <w:r>
+        <w:rPr>
+          <w:b w:val="1"/>
+          <w:bCs w:val="1"/>
+          <w:sz w:val="28"/>
+          <w:szCs w:val="28"/>
+          <w:rtl w:val="0"/>
+        </w:rPr>
+        <w:t xml:space="preserve">Trabalhos de Base</w:t>
+      </w:r>
+    </w:p>
+    <w:p>
+      <w:pPr>
+        <w:ind w:left="0" w:firstLine="0"/>
+        <w:jc w:val="both"/>
+        <w:rPr>
+          <w:sz w:val="28"/>
+          <w:szCs w:val="28"/>
+        </w:rPr>
+      </w:pPr>
+      <w:r>
+        <w:rPr>
+          <w:sz w:val="28"/>
+          <w:szCs w:val="28"/>
+          <w:rtl w:val="0"/>
+        </w:rPr>
+        <w:t xml:space="preserve">O trabalho seminal de </w:t>
+      </w:r>
+      <w:r>
+        <w:rPr>
+          <w:sz w:val="28"/>
+          <w:szCs w:val="28"/>
+          <w:rtl w:val="0"/>
+        </w:rPr>
+        <w:t xml:space="preserve">DQAOA</w:t>
+      </w:r>
+      <w:r>
+        <w:rPr>
+          <w:sz w:val="28"/>
+          <w:szCs w:val="28"/>
+          <w:rtl w:val="0"/>
+        </w:rPr>
+        <w:t xml:space="preserve"> está presente em:  </w:t>
       </w:r>
       <w:hyperlink r:id="rId6">
         <w:r>
@@ -286,7 +595,15 @@
           <w:szCs w:val="28"/>
           <w:rtl w:val="0"/>
         </w:rPr>
-        <w:t xml:space="preserve">. Além deste, serão utilizados outras pesquisas que discutem melhores maneiras e diferentes idéias para este fim, como por exemplo:</w:t>
+        <w:t xml:space="preserve">. Contudo, nesta revisão também serão utilizados outros artigos que </w:t>
+      </w:r>
+      <w:r>
+        <w:rPr>
+          <w:sz w:val="28"/>
+          <w:szCs w:val="28"/>
+          <w:rtl w:val="0"/>
+        </w:rPr>
+        <w:t xml:space="preserve">discutem novos métodos e otimizações para o algoritmo proposto, como por exemplo em:</w:t>
       </w:r>
     </w:p>
     <w:p>
@@ -376,6 +693,96 @@
           <w:t xml:space="preserve">QAOA in Quantum Datacenters: Parallelization, Simulation, and Orchestration</w:t>
         </w:r>
       </w:hyperlink>
+      <w:r>
+        <w:rPr>
+          <w:rtl w:val="0"/>
+        </w:rPr>
+      </w:r>
+    </w:p>
+    <w:p>
+      <w:pPr>
+        <w:jc w:val="both"/>
+        <w:rPr>
+          <w:sz w:val="28"/>
+          <w:szCs w:val="28"/>
+        </w:rPr>
+      </w:pPr>
+      <w:r>
+        <w:rPr>
+          <w:rtl w:val="0"/>
+        </w:rPr>
+      </w:r>
+    </w:p>
+    <w:p>
+      <w:pPr>
+        <w:jc w:val="both"/>
+        <w:rPr>
+          <w:b w:val="1"/>
+          <w:bCs w:val="1"/>
+          <w:sz w:val="28"/>
+          <w:szCs w:val="28"/>
+        </w:rPr>
+      </w:pPr>
+      <w:r>
+        <w:rPr>
+          <w:b w:val="1"/>
+          <w:bCs w:val="1"/>
+          <w:sz w:val="28"/>
+          <w:szCs w:val="28"/>
+          <w:rtl w:val="0"/>
+        </w:rPr>
+        <w:t xml:space="preserve">Motivação</w:t>
+      </w:r>
+    </w:p>
+    <w:p>
+      <w:pPr>
+        <w:jc w:val="both"/>
+        <w:rPr>
+          <w:sz w:val="28"/>
+          <w:szCs w:val="28"/>
+        </w:rPr>
+      </w:pPr>
+      <w:r>
+        <w:rPr>
+          <w:sz w:val="28"/>
+          <w:szCs w:val="28"/>
+          <w:rtl w:val="0"/>
+        </w:rPr>
+        <w:t xml:space="preserve">A decisão do tema deste trabalho se deu com base no tema da minha pesquisa de mestrado. Nela, utilizarei </w:t>
+      </w:r>
+      <w:r>
+        <w:rPr>
+          <w:sz w:val="28"/>
+          <w:szCs w:val="28"/>
+          <w:rtl w:val="0"/>
+        </w:rPr>
+        <w:t xml:space="preserve">DQAOA</w:t>
+      </w:r>
+      <w:r>
+        <w:rPr>
+          <w:sz w:val="28"/>
+          <w:szCs w:val="28"/>
+          <w:rtl w:val="0"/>
+        </w:rPr>
+        <w:t xml:space="preserve"> para acelerar certos algoritmos em bioinformática. </w:t>
+      </w:r>
+    </w:p>
+    <w:p>
+      <w:pPr>
+        <w:jc w:val="both"/>
+        <w:rPr>
+          <w:sz w:val="28"/>
+          <w:szCs w:val="28"/>
+        </w:rPr>
+      </w:pPr>
+      <w:r>
+        <w:rPr>
+          <w:sz w:val="28"/>
+          <w:szCs w:val="28"/>
+          <w:rtl w:val="0"/>
+        </w:rPr>
+        <w:t xml:space="preserve">Sendo assim, este trabalho surgiu de encontro com os interesses do meu projeto de mestrado e me proporcionou a possibilidade de aproveitar o momento para já desbravar a literatura atual.</w:t>
+      </w:r>
       <w:r>
         <w:rPr>
           <w:rtl w:val="0"/>

</xml_diff>